<commit_message>
casd motion-brief docx: Times New Roman (the typst face) via docx/reference.xml; 27 lines and 1 in right and bottom margins as typst (DEF-FORM-002, DEF-CONT-001), line numbers ending 1 in from the edge; cover as typst's caption table; three sections with the typst footer (page number, title, case number) through FORMBOOK_FOOTERS (docxpass); TOC and TOA page numbers from the multi-pass engine (docxpages: pleading line numbers left out of the page text); check.sh --engine docx 8 passed 0 failed (fb-595.63)
</commit_message>
<xml_diff>
--- a/courts/ninth-circuit/california/federal/southern-district/motion-brief/usage/OUTPUT-motion-brief.docx
+++ b/courts/ninth-circuit/california/federal/southern-district/motion-brief/usage/OUTPUT-motion-brief.docx
@@ -103,11 +103,195 @@
     </w:p>
     <w:p>
       <w:pPr>
-        <w:spacing w:before="0" w:after="0" w:line="480" w:lineRule="auto"/>
-      </w:pPr>
-      <w:r>
-        <w:t xml:space="preserve"/>
-      </w:r>
+        <w:spacing w:before="240" w:after="0" w:line="240" w:lineRule="auto"/>
+        <w:jc w:val="center"/>
+      </w:pPr>
+      <w:r>
+        <w:rPr>
+          <w:b/>
+        </w:rPr>
+        <w:t xml:space="preserve">UNITED STATES DISTRICT COURT</w:t>
+      </w:r>
+    </w:p>
+    <w:p>
+      <w:pPr>
+        <w:spacing w:before="0" w:after="0" w:line="240" w:lineRule="auto"/>
+        <w:jc w:val="center"/>
+      </w:pPr>
+      <w:r>
+        <w:rPr>
+          <w:b/>
+        </w:rPr>
+        <w:t xml:space="preserve">SOUTHERN DISTRICT OF CALIFORNIA</w:t>
+      </w:r>
+    </w:p>
+    <w:p>
+      <w:pPr>
+        <w:spacing w:before="0" w:after="240" w:line="240" w:lineRule="auto"/>
+        <w:jc w:val="center"/>
+      </w:pPr>
+      <w:r>
+        <w:rPr>
+          <w:b/>
+        </w:rPr>
+        <w:t xml:space="preserve">SAN DIEGO</w:t>
+      </w:r>
+    </w:p>
+    <w:tbl>
+      <w:tblPr>
+        <w:tblW w:w="8640" w:type="dxa"/>
+        <w:tblLayout w:type="fixed"/>
+        <w:tblCellMar>
+          <w:left w:w="0" w:type="dxa"/>
+          <w:right w:w="0" w:type="dxa"/>
+        </w:tblCellMar>
+        <w:tblLook w:val="0000"/>
+      </w:tblPr>
+      <w:tblGrid>
+        <w:gridCol w:w="4320"/>
+        <w:gridCol w:w="4320"/>
+      </w:tblGrid>
+      <w:tr>
+        <w:trPr>
+          <w:cantSplit/>
+        </w:trPr>
+        <w:tc>
+          <w:tcPr>
+            <w:tcW w:w="4320" w:type="dxa"/>
+            <w:tcBorders>
+              <w:bottom w:val="single" w:sz="6" w:space="0" w:color="000000"/>
+              <w:right w:val="single" w:sz="6" w:space="0" w:color="000000"/>
+            </w:tcBorders>
+            <w:tcMar>
+              <w:bottom w:w="140" w:type="dxa"/>
+              <w:right w:w="336" w:type="dxa"/>
+            </w:tcMar>
+          </w:tcPr>
+          <w:p>
+            <w:pPr>
+              <w:spacing w:before="0" w:after="0" w:line="240" w:lineRule="auto"/>
+            </w:pPr>
+            <w:r>
+              <w:t xml:space="preserve">JENNIFER SAGER, individually and on behalf of all others similarly situated,</w:t>
+            </w:r>
+          </w:p>
+          <w:p>
+            <w:pPr>
+              <w:spacing w:before="0" w:after="0" w:line="240" w:lineRule="auto"/>
+              <w:ind w:left="2592" w:firstLine="0"/>
+            </w:pPr>
+            <w:r>
+              <w:t xml:space="preserve">Plaintiff,</w:t>
+            </w:r>
+          </w:p>
+          <w:p>
+            <w:pPr>
+              <w:spacing w:before="240" w:after="240" w:line="240" w:lineRule="auto"/>
+              <w:jc w:val="center"/>
+            </w:pPr>
+            <w:r>
+              <w:t xml:space="preserve">v.</w:t>
+            </w:r>
+          </w:p>
+          <w:p>
+            <w:pPr>
+              <w:spacing w:before="0" w:after="0" w:line="240" w:lineRule="auto"/>
+            </w:pPr>
+            <w:r>
+              <w:t xml:space="preserve">CETERA FINANCIAL GROUP, INC. and CETERA INVESTMENT SERVICES LLC,</w:t>
+            </w:r>
+          </w:p>
+          <w:p>
+            <w:pPr>
+              <w:spacing w:before="0" w:after="0" w:line="240" w:lineRule="auto"/>
+              <w:ind w:left="2592" w:firstLine="0"/>
+            </w:pPr>
+            <w:r>
+              <w:t xml:space="preserve">Defendants.</w:t>
+            </w:r>
+          </w:p>
+        </w:tc>
+        <w:tc>
+          <w:tcPr>
+            <w:tcW w:w="4320" w:type="dxa"/>
+            <w:tcMar>
+              <w:top w:w="84" w:type="dxa"/>
+              <w:left w:w="336" w:type="dxa"/>
+            </w:tcMar>
+          </w:tcPr>
+          <w:p>
+            <w:pPr>
+              <w:spacing w:before="0" w:after="0" w:line="240" w:lineRule="auto"/>
+            </w:pPr>
+            <w:r>
+              <w:t xml:space="preserve">Case No. 3:26-cv-03372-RSH-VET</w:t>
+            </w:r>
+          </w:p>
+          <w:p>
+            <w:pPr>
+              <w:spacing w:before="240" w:after="240" w:line="240" w:lineRule="auto"/>
+            </w:pPr>
+            <w:r>
+              <w:rPr>
+                <w:b/>
+              </w:rPr>
+              <w:t xml:space="preserve">MEMORANDUM OF POINTS AND AUTHORITIES IN SUPPORT OF DEFENDANTS’ MOTION TO DISMISS COMPLAINT</w:t>
+            </w:r>
+          </w:p>
+          <w:p>
+            <w:pPr>
+              <w:spacing w:before="0" w:after="0" w:line="240" w:lineRule="auto"/>
+            </w:pPr>
+            <w:r>
+              <w:t xml:space="preserve">Date: October 5, 2026</w:t>
+            </w:r>
+          </w:p>
+          <w:p>
+            <w:pPr>
+              <w:spacing w:before="0" w:after="0" w:line="240" w:lineRule="auto"/>
+            </w:pPr>
+            <w:r>
+              <w:t xml:space="preserve">Time: Under Submission</w:t>
+            </w:r>
+          </w:p>
+          <w:p>
+            <w:pPr>
+              <w:spacing w:before="0" w:after="0" w:line="240" w:lineRule="auto"/>
+            </w:pPr>
+            <w:r>
+              <w:t xml:space="preserve">Place: Courtroom 3B</w:t>
+            </w:r>
+          </w:p>
+          <w:p>
+            <w:pPr>
+              <w:spacing w:before="0" w:after="0" w:line="240" w:lineRule="auto"/>
+            </w:pPr>
+            <w:r>
+              <w:t xml:space="preserve">Hon. Robert S. Huie</w:t>
+            </w:r>
+          </w:p>
+        </w:tc>
+      </w:tr>
+    </w:tbl>
+    <w:p>
+      <w:pPr>
+        <w:suppressLineNumbers/>
+        <w:spacing w:before="0" w:after="0" w:line="20" w:lineRule="exact"/>
+        <w:sectPr>
+          <w:footerReference w:type="default" r:id="rIdCasdCover"/>
+          <w:footnotePr>
+            <w:numRestart w:val="eachSect"/>
+          </w:footnotePr>
+          <w:type w:val="nextPage"/>
+          <w:pgSz w:w="12240" w:h="15840"/>
+          <w:pgMar w:top="1440" w:right="1440" w:bottom="1440" w:left="2160" w:header="720" w:footer="120" w:gutter="0"/>
+          <w:pgBorders w:offsetFrom="text">
+            <w:left w:val="double" w:sz="4" w:space="14" w:color="auto"/>
+            <w:right w:val="single" w:sz="4" w:space="7" w:color="auto"/>
+          </w:pgBorders>
+          <w:lnNumType w:countBy="1" w:distance="720" w:restart="newPage"/>
+        </w:sectPr>
+      </w:pPr>
     </w:p>
     <w:p>
       <w:pPr>
@@ -118,11 +302,219 @@
         <w:rPr>
           <w:b/>
         </w:rPr>
-        <w:t xml:space="preserve">UNITED STATES DISTRICT COURT</w:t>
-      </w:r>
-    </w:p>
-    <w:p>
-      <w:pPr>
+        <w:t xml:space="preserve">TABLE OF CONTENTS</w:t>
+      </w:r>
+    </w:p>
+    <w:p>
+      <w:pPr>
+        <w:keepNext/>
+        <w:spacing w:before="0" w:after="120" w:line="240" w:lineRule="auto"/>
+        <w:jc w:val="right"/>
+      </w:pPr>
+      <w:r>
+        <w:rPr>
+          <w:b/>
+        </w:rPr>
+        <w:t xml:space="preserve">Page</w:t>
+      </w:r>
+    </w:p>
+    <w:p>
+      <w:pPr>
+        <w:keepLines/>
+        <w:tabs>
+          <w:tab w:val="right" w:leader="dot" w:pos="8620"/>
+        </w:tabs>
+        <w:spacing w:before="0" w:after="120" w:line="240" w:lineRule="auto"/>
+        <w:ind w:left="720" w:right="720" w:hanging="720"/>
+      </w:pPr>
+      <w:r>
+        <w:t xml:space="preserve">INTRODUCTION</w:t>
+      </w:r>
+      <w:r>
+        <w:t xml:space="preserve"> </w:t>
+      </w:r>
+      <w:r>
+        <w:tab/>
+      </w:r>
+      <w:r>
+        <w:t xml:space="preserve">1</w:t>
+      </w:r>
+    </w:p>
+    <w:p>
+      <w:pPr>
+        <w:keepLines/>
+        <w:tabs>
+          <w:tab w:val="right" w:leader="dot" w:pos="8620"/>
+        </w:tabs>
+        <w:spacing w:before="0" w:after="120" w:line="240" w:lineRule="auto"/>
+        <w:ind w:left="720" w:right="720" w:hanging="720"/>
+      </w:pPr>
+      <w:r>
+        <w:t xml:space="preserve">FACTUAL BACKGROUND</w:t>
+      </w:r>
+      <w:r>
+        <w:t xml:space="preserve"> </w:t>
+      </w:r>
+      <w:r>
+        <w:tab/>
+      </w:r>
+      <w:r>
+        <w:t xml:space="preserve">1</w:t>
+      </w:r>
+    </w:p>
+    <w:p>
+      <w:pPr>
+        <w:keepLines/>
+        <w:tabs>
+          <w:tab w:val="right" w:leader="dot" w:pos="8620"/>
+        </w:tabs>
+        <w:spacing w:before="0" w:after="120" w:line="240" w:lineRule="auto"/>
+        <w:ind w:left="720" w:right="720" w:hanging="720"/>
+      </w:pPr>
+      <w:r>
+        <w:t xml:space="preserve">STANDARD OF REVIEW</w:t>
+      </w:r>
+      <w:r>
+        <w:t xml:space="preserve"> </w:t>
+      </w:r>
+      <w:r>
+        <w:tab/>
+      </w:r>
+      <w:r>
+        <w:t xml:space="preserve">2</w:t>
+      </w:r>
+    </w:p>
+    <w:p>
+      <w:pPr>
+        <w:keepLines/>
+        <w:tabs>
+          <w:tab w:val="right" w:leader="dot" w:pos="8620"/>
+        </w:tabs>
+        <w:spacing w:before="0" w:after="120" w:line="240" w:lineRule="auto"/>
+        <w:ind w:left="720" w:right="720" w:hanging="720"/>
+      </w:pPr>
+      <w:r>
+        <w:t xml:space="preserve">ARGUMENT</w:t>
+      </w:r>
+      <w:r>
+        <w:t xml:space="preserve"> </w:t>
+      </w:r>
+      <w:r>
+        <w:tab/>
+      </w:r>
+      <w:r>
+        <w:t xml:space="preserve">3</w:t>
+      </w:r>
+    </w:p>
+    <w:p>
+      <w:pPr>
+        <w:keepLines/>
+        <w:tabs>
+          <w:tab w:val="right" w:leader="dot" w:pos="8620"/>
+        </w:tabs>
+        <w:spacing w:before="0" w:after="120" w:line="240" w:lineRule="auto"/>
+        <w:ind w:left="720" w:right="720" w:hanging="720"/>
+      </w:pPr>
+      <w:r>
+        <w:t xml:space="preserve">I.</w:t>
+      </w:r>
+      <w:r>
+        <w:tab/>
+      </w:r>
+      <w:r>
+        <w:t xml:space="preserve">The Complaint Fails Rule 8’s Basic Pleading Standards and Should Be Dismissed Under Rule 12(b)(6) or a More Definite Statement Should Be Required.</w:t>
+      </w:r>
+      <w:r>
+        <w:t xml:space="preserve"> </w:t>
+      </w:r>
+      <w:r>
+        <w:tab/>
+      </w:r>
+      <w:r>
+        <w:t xml:space="preserve">3</w:t>
+      </w:r>
+    </w:p>
+    <w:p>
+      <w:pPr>
+        <w:keepLines/>
+        <w:tabs>
+          <w:tab w:val="right" w:leader="dot" w:pos="8620"/>
+        </w:tabs>
+        <w:spacing w:before="0" w:after="120" w:line="240" w:lineRule="auto"/>
+        <w:ind w:left="720" w:right="720" w:hanging="720"/>
+      </w:pPr>
+      <w:r>
+        <w:t xml:space="preserve">II.</w:t>
+      </w:r>
+      <w:r>
+        <w:tab/>
+      </w:r>
+      <w:r>
+        <w:t xml:space="preserve">CFG Should Be Dismissed as a Defendant</w:t>
+      </w:r>
+      <w:r>
+        <w:t xml:space="preserve"> </w:t>
+      </w:r>
+      <w:r>
+        <w:tab/>
+      </w:r>
+      <w:r>
+        <w:t xml:space="preserve">3</w:t>
+      </w:r>
+    </w:p>
+    <w:p>
+      <w:pPr>
+        <w:keepLines/>
+        <w:tabs>
+          <w:tab w:val="right" w:leader="dot" w:pos="8620"/>
+        </w:tabs>
+        <w:spacing w:before="0" w:after="120" w:line="240" w:lineRule="auto"/>
+        <w:ind w:left="720" w:right="720" w:hanging="720"/>
+      </w:pPr>
+      <w:r>
+        <w:t xml:space="preserve">III.</w:t>
+      </w:r>
+      <w:r>
+        <w:tab/>
+      </w:r>
+      <w:r>
+        <w:t xml:space="preserve">Plaintiff Fails to State a Claim for Unjust Enrichment (Count VI)</w:t>
+      </w:r>
+      <w:r>
+        <w:t xml:space="preserve"> </w:t>
+      </w:r>
+      <w:r>
+        <w:tab/>
+      </w:r>
+      <w:r>
+        <w:t xml:space="preserve">4</w:t>
+      </w:r>
+    </w:p>
+    <w:p>
+      <w:pPr>
+        <w:keepLines/>
+        <w:tabs>
+          <w:tab w:val="right" w:leader="dot" w:pos="8620"/>
+        </w:tabs>
+        <w:spacing w:before="0" w:after="120" w:line="240" w:lineRule="auto"/>
+        <w:ind w:left="720" w:right="720" w:hanging="720"/>
+      </w:pPr>
+      <w:r>
+        <w:t xml:space="preserve">CONCLUSION</w:t>
+      </w:r>
+      <w:r>
+        <w:t xml:space="preserve"> </w:t>
+      </w:r>
+      <w:r>
+        <w:tab/>
+      </w:r>
+      <w:r>
+        <w:t xml:space="preserve">6</w:t>
+      </w:r>
+    </w:p>
+    <w:p>
+      <w:pPr>
+        <w:pageBreakBefore/>
         <w:spacing w:before="0" w:after="0" w:line="480" w:lineRule="auto"/>
         <w:jc w:val="center"/>
       </w:pPr>
@@ -130,383 +522,366 @@
         <w:rPr>
           <w:b/>
         </w:rPr>
-        <w:t xml:space="preserve">SOUTHERN DISTRICT OF CALIFORNIA</w:t>
-      </w:r>
-    </w:p>
-    <w:p>
-      <w:pPr>
-        <w:spacing w:before="0" w:after="0" w:line="480" w:lineRule="auto"/>
-        <w:jc w:val="center"/>
+        <w:t xml:space="preserve">TABLE OF AUTHORITIES</w:t>
+      </w:r>
+    </w:p>
+    <w:p>
+      <w:pPr>
+        <w:keepNext/>
+        <w:spacing w:before="0" w:after="120" w:line="240" w:lineRule="auto"/>
+        <w:jc w:val="right"/>
       </w:pPr>
       <w:r>
         <w:rPr>
           <w:b/>
         </w:rPr>
-        <w:t xml:space="preserve">SAN DIEGO</w:t>
-      </w:r>
-    </w:p>
-    <w:p>
-      <w:pPr>
-        <w:spacing w:before="0" w:after="0" w:line="480" w:lineRule="auto"/>
-      </w:pPr>
-      <w:r>
-        <w:t xml:space="preserve"/>
-      </w:r>
-    </w:p>
-    <w:p>
-      <w:pPr>
-        <w:spacing w:before="0" w:after="0" w:line="240" w:lineRule="auto"/>
-      </w:pPr>
-      <w:r>
-        <w:t xml:space="preserve">JENNIFER SAGER, individually and on behalf of all others similarly situated,</w:t>
-      </w:r>
-    </w:p>
-    <w:p>
-      <w:pPr>
-        <w:spacing w:before="0" w:after="0" w:line="240" w:lineRule="auto"/>
-        <w:ind w:left="1440" w:firstLine="0"/>
-      </w:pPr>
-      <w:r>
-        <w:t xml:space="preserve">Plaintiff,</w:t>
-      </w:r>
-    </w:p>
-    <w:p>
-      <w:pPr>
-        <w:spacing w:before="0" w:after="0" w:line="240" w:lineRule="auto"/>
-        <w:ind w:left="720" w:firstLine="0"/>
-      </w:pPr>
-      <w:r>
-        <w:t xml:space="preserve">v.</w:t>
-      </w:r>
-    </w:p>
-    <w:p>
-      <w:pPr>
-        <w:spacing w:before="0" w:after="0" w:line="240" w:lineRule="auto"/>
-      </w:pPr>
-      <w:r>
-        <w:t xml:space="preserve">CETERA FINANCIAL GROUP, INC. and CETERA INVESTMENT SERVICES LLC,</w:t>
-      </w:r>
-    </w:p>
-    <w:p>
-      <w:pPr>
-        <w:spacing w:before="0" w:after="0" w:line="240" w:lineRule="auto"/>
-        <w:ind w:left="1440" w:firstLine="0"/>
-      </w:pPr>
-      <w:r>
-        <w:t xml:space="preserve">Defendants.</w:t>
-      </w:r>
-    </w:p>
-    <w:p>
-      <w:pPr>
-        <w:spacing w:before="0" w:after="0" w:line="480" w:lineRule="auto"/>
-        <w:ind w:left="4680" w:firstLine="0"/>
-      </w:pPr>
-      <w:r>
-        <w:t xml:space="preserve">Case No. 3:26-cv-03372-RSH-VET</w:t>
-      </w:r>
-    </w:p>
-    <w:p>
-      <w:pPr>
-        <w:spacing w:before="0" w:after="0" w:line="480" w:lineRule="auto"/>
-      </w:pPr>
-      <w:r>
-        <w:t xml:space="preserve"/>
-      </w:r>
-    </w:p>
-    <w:p>
-      <w:pPr>
-        <w:spacing w:before="0" w:after="0" w:line="480" w:lineRule="auto"/>
-        <w:jc w:val="center"/>
+        <w:t xml:space="preserve">Page(s)</w:t>
+      </w:r>
+    </w:p>
+    <w:p>
+      <w:pPr>
+        <w:keepNext/>
+        <w:spacing w:before="240" w:after="120" w:line="240" w:lineRule="auto"/>
       </w:pPr>
       <w:r>
         <w:rPr>
           <w:b/>
         </w:rPr>
-        <w:t xml:space="preserve">Memorandum of Points and Authorities in Support of Defendants’ Motion to Dismiss Complaint</w:t>
-      </w:r>
-    </w:p>
-    <w:p>
-      <w:pPr>
-        <w:spacing w:before="0" w:after="0" w:line="480" w:lineRule="auto"/>
-      </w:pPr>
-      <w:r>
-        <w:t xml:space="preserve"/>
-      </w:r>
-    </w:p>
-    <w:p>
-      <w:pPr>
-        <w:spacing w:before="0" w:after="0" w:line="240" w:lineRule="auto"/>
-        <w:ind w:left="4680" w:firstLine="0"/>
-      </w:pPr>
-      <w:r>
-        <w:t xml:space="preserve">Date: October 5, 2026</w:t>
-      </w:r>
-    </w:p>
-    <w:p>
-      <w:pPr>
-        <w:spacing w:before="0" w:after="0" w:line="240" w:lineRule="auto"/>
-        <w:ind w:left="4680" w:firstLine="0"/>
-      </w:pPr>
-      <w:r>
-        <w:t xml:space="preserve">Time: Under Submission</w:t>
-      </w:r>
-    </w:p>
-    <w:p>
-      <w:pPr>
-        <w:spacing w:before="0" w:after="0" w:line="240" w:lineRule="auto"/>
-        <w:ind w:left="4680" w:firstLine="0"/>
-      </w:pPr>
-      <w:r>
-        <w:t xml:space="preserve">Courtroom 3B</w:t>
-      </w:r>
-    </w:p>
-    <w:p>
-      <w:pPr>
-        <w:spacing w:before="0" w:after="0" w:line="240" w:lineRule="auto"/>
-        <w:ind w:left="4680" w:firstLine="0"/>
-      </w:pPr>
-      <w:r>
-        <w:t xml:space="preserve">Judge: Hon. Robert S. Huie</w:t>
-      </w:r>
-    </w:p>
-    <w:p>
-      <w:r>
-        <w:br w:type="page"/>
-      </w:r>
-    </w:p>
-    <w:p>
-      <w:pPr>
-        <w:spacing w:before="0" w:after="0" w:line="480" w:lineRule="auto"/>
-        <w:jc w:val="center"/>
+        <w:t xml:space="preserve">Cases</w:t>
+      </w:r>
+    </w:p>
+    <w:p>
+      <w:pPr>
+        <w:keepLines/>
+        <w:tabs>
+          <w:tab w:val="right" w:leader="dot" w:pos="8620"/>
+        </w:tabs>
+        <w:spacing w:before="0" w:after="120" w:line="240" w:lineRule="auto"/>
+        <w:ind w:left="504" w:right="1120" w:hanging="504"/>
+      </w:pPr>
+      <w:r>
+        <w:rPr>
+          <w:i/>
+        </w:rPr>
+        <w:t xml:space="preserve">Ashcroft v. Iqbal</w:t>
+      </w:r>
+      <w:r>
+        <w:t xml:space="preserve">, 556 U.S. 662 (2009)</w:t>
+      </w:r>
+      <w:r>
+        <w:t xml:space="preserve"> </w:t>
+      </w:r>
+      <w:r>
+        <w:tab/>
+      </w:r>
+      <w:r>
+        <w:t xml:space="preserve">2</w:t>
+      </w:r>
+    </w:p>
+    <w:p>
+      <w:pPr>
+        <w:keepLines/>
+        <w:tabs>
+          <w:tab w:val="right" w:leader="dot" w:pos="8620"/>
+        </w:tabs>
+        <w:spacing w:before="0" w:after="120" w:line="240" w:lineRule="auto"/>
+        <w:ind w:left="504" w:right="1120" w:hanging="504"/>
+      </w:pPr>
+      <w:r>
+        <w:rPr>
+          <w:i/>
+        </w:rPr>
+        <w:t xml:space="preserve">Bell Atl. Corp. v. Twombly</w:t>
+      </w:r>
+      <w:r>
+        <w:t xml:space="preserve">, 550 U.S. 544 (2007)</w:t>
+      </w:r>
+      <w:r>
+        <w:t xml:space="preserve"> </w:t>
+      </w:r>
+      <w:r>
+        <w:tab/>
+      </w:r>
+      <w:r>
+        <w:t xml:space="preserve">2</w:t>
+      </w:r>
+    </w:p>
+    <w:p>
+      <w:pPr>
+        <w:keepLines/>
+        <w:tabs>
+          <w:tab w:val="right" w:leader="dot" w:pos="8620"/>
+        </w:tabs>
+        <w:spacing w:before="0" w:after="120" w:line="240" w:lineRule="auto"/>
+        <w:ind w:left="504" w:right="1120" w:hanging="504"/>
+      </w:pPr>
+      <w:r>
+        <w:rPr>
+          <w:i/>
+        </w:rPr>
+        <w:t xml:space="preserve">Bernstein v. Extendicare Health Servs.</w:t>
+      </w:r>
+      <w:r>
+        <w:t xml:space="preserve">, 607 F. Supp. 2d 1027 (D. Minn. 2009)</w:t>
+      </w:r>
+      <w:r>
+        <w:t xml:space="preserve"> </w:t>
+      </w:r>
+      <w:r>
+        <w:tab/>
+      </w:r>
+      <w:r>
+        <w:t xml:space="preserve">3</w:t>
+      </w:r>
+    </w:p>
+    <w:p>
+      <w:pPr>
+        <w:keepLines/>
+        <w:tabs>
+          <w:tab w:val="right" w:leader="dot" w:pos="8620"/>
+        </w:tabs>
+        <w:spacing w:before="0" w:after="120" w:line="240" w:lineRule="auto"/>
+        <w:ind w:left="504" w:right="1120" w:hanging="504"/>
+      </w:pPr>
+      <w:r>
+        <w:rPr>
+          <w:i/>
+        </w:rPr>
+        <w:t xml:space="preserve">Futo v. U.S. Bancorp</w:t>
+      </w:r>
+      <w:r>
+        <w:t xml:space="preserve">, 826 F. Supp. 3d 1016 (D. Minn. 2026)</w:t>
+      </w:r>
+      <w:r>
+        <w:t xml:space="preserve"> </w:t>
+      </w:r>
+      <w:r>
+        <w:tab/>
+      </w:r>
+      <w:r>
+        <w:t xml:space="preserve">1, 4</w:t>
+      </w:r>
+    </w:p>
+    <w:p>
+      <w:pPr>
+        <w:keepLines/>
+        <w:tabs>
+          <w:tab w:val="right" w:leader="dot" w:pos="8620"/>
+        </w:tabs>
+        <w:spacing w:before="0" w:after="120" w:line="240" w:lineRule="auto"/>
+        <w:ind w:left="504" w:right="1120" w:hanging="504"/>
+      </w:pPr>
+      <w:r>
+        <w:rPr>
+          <w:i/>
+        </w:rPr>
+        <w:t xml:space="preserve">ServiceMaster of St. Cloud v. GAB Bus. Servs., Inc.</w:t>
+      </w:r>
+      <w:r>
+        <w:t xml:space="preserve">, 544 N.W.2d 302 (Minn. 1996)</w:t>
+      </w:r>
+      <w:r>
+        <w:t xml:space="preserve"> </w:t>
+      </w:r>
+      <w:r>
+        <w:tab/>
+      </w:r>
+      <w:r>
+        <w:t xml:space="preserve">4</w:t>
+      </w:r>
+    </w:p>
+    <w:p>
+      <w:pPr>
+        <w:keepLines/>
+        <w:tabs>
+          <w:tab w:val="right" w:leader="dot" w:pos="8620"/>
+        </w:tabs>
+        <w:spacing w:before="0" w:after="120" w:line="240" w:lineRule="auto"/>
+        <w:ind w:left="504" w:right="1120" w:hanging="504"/>
+      </w:pPr>
+      <w:r>
+        <w:rPr>
+          <w:i/>
+        </w:rPr>
+        <w:t xml:space="preserve">Souter v. Edgewell Pers. Care Co.</w:t>
+      </w:r>
+      <w:r>
+        <w:t xml:space="preserve">, 542 F. Supp. 3d 1083 (S.D. Cal. 2021)</w:t>
+      </w:r>
+      <w:r>
+        <w:t xml:space="preserve"> </w:t>
+      </w:r>
+      <w:r>
+        <w:tab/>
+      </w:r>
+      <w:r>
+        <w:t xml:space="preserve">3</w:t>
+      </w:r>
+    </w:p>
+    <w:p>
+      <w:pPr>
+        <w:keepLines/>
+        <w:tabs>
+          <w:tab w:val="right" w:leader="dot" w:pos="8620"/>
+        </w:tabs>
+        <w:spacing w:before="0" w:after="120" w:line="240" w:lineRule="auto"/>
+        <w:ind w:left="504" w:right="1120" w:hanging="504"/>
+      </w:pPr>
+      <w:r>
+        <w:rPr>
+          <w:i/>
+        </w:rPr>
+        <w:t xml:space="preserve">United States v. Bestfoods</w:t>
+      </w:r>
+      <w:r>
+        <w:t xml:space="preserve">, 524 U.S. 51 (1998)</w:t>
+      </w:r>
+      <w:r>
+        <w:t xml:space="preserve"> </w:t>
+      </w:r>
+      <w:r>
+        <w:tab/>
+      </w:r>
+      <w:r>
+        <w:t xml:space="preserve">4</w:t>
+      </w:r>
+    </w:p>
+    <w:p>
+      <w:pPr>
+        <w:keepLines/>
+        <w:tabs>
+          <w:tab w:val="right" w:leader="dot" w:pos="8620"/>
+        </w:tabs>
+        <w:spacing w:before="0" w:after="120" w:line="240" w:lineRule="auto"/>
+        <w:ind w:left="504" w:right="1120" w:hanging="504"/>
+      </w:pPr>
+      <w:r>
+        <w:rPr>
+          <w:i/>
+        </w:rPr>
+        <w:t xml:space="preserve">Wright v. Capella Univ., Inc.</w:t>
+      </w:r>
+      <w:r>
+        <w:t xml:space="preserve">, 378 F. Supp. 3d 760 (D. Minn. 2019)</w:t>
+      </w:r>
+      <w:r>
+        <w:t xml:space="preserve"> </w:t>
+      </w:r>
+      <w:r>
+        <w:tab/>
+      </w:r>
+      <w:r>
+        <w:t xml:space="preserve">5</w:t>
+      </w:r>
+    </w:p>
+    <w:p>
+      <w:pPr>
+        <w:keepNext/>
+        <w:spacing w:before="240" w:after="120" w:line="240" w:lineRule="auto"/>
       </w:pPr>
       <w:r>
         <w:rPr>
           <w:b/>
         </w:rPr>
-        <w:t xml:space="preserve">TABLE OF CONTENTS</w:t>
-      </w:r>
-    </w:p>
-    <w:p>
-      <w:pPr>
-        <w:spacing w:before="0" w:after="0" w:line="240" w:lineRule="auto"/>
-      </w:pPr>
-      <w:r>
-        <w:fldChar w:fldCharType="begin" w:dirty="true"/>
-      </w:r>
-      <w:r>
-        <w:instrText xml:space="preserve"> TOC \o "1-3" \h \z \u </w:instrText>
-      </w:r>
-      <w:r>
-        <w:fldChar w:fldCharType="separate"/>
-      </w:r>
-      <w:r>
-        <w:t>Update the field (select all, then F9) to build the table of contents.</w:t>
-      </w:r>
-      <w:r>
-        <w:fldChar w:fldCharType="end"/>
-      </w:r>
-    </w:p>
-    <w:p>
-      <w:r>
-        <w:br w:type="page"/>
-      </w:r>
-    </w:p>
-    <w:p>
-      <w:pPr>
-        <w:spacing w:before="0" w:after="0" w:line="480" w:lineRule="auto"/>
-        <w:jc w:val="center"/>
-      </w:pPr>
-      <w:r>
-        <w:rPr>
-          <w:b/>
-        </w:rPr>
-        <w:t xml:space="preserve">TABLE OF AUTHORITIES</w:t>
-      </w:r>
-    </w:p>
-    <w:p>
-      <w:pPr>
-        <w:keepNext/>
-        <w:spacing w:before="240" w:after="240" w:line="240" w:lineRule="auto"/>
-      </w:pPr>
-      <w:r>
-        <w:rPr>
-          <w:b/>
-        </w:rPr>
-        <w:t xml:space="preserve">Cases:</w:t>
-      </w:r>
-    </w:p>
-    <w:p>
-      <w:pPr>
-        <w:spacing w:before="0" w:after="240" w:line="240" w:lineRule="auto"/>
-        <w:ind w:left="360" w:firstLine="0"/>
-      </w:pPr>
-      <w:r>
-        <w:rPr>
-          <w:i/>
-        </w:rPr>
-        <w:t xml:space="preserve">Ashcroft v. Iqbal</w:t>
-      </w:r>
-      <w:r>
-        <w:t xml:space="preserve">, 556 U.S. 662 (2009)</w:t>
-      </w:r>
-    </w:p>
-    <w:p>
-      <w:pPr>
-        <w:spacing w:before="0" w:after="240" w:line="240" w:lineRule="auto"/>
-        <w:ind w:left="360" w:firstLine="0"/>
-      </w:pPr>
-      <w:r>
-        <w:rPr>
-          <w:i/>
-        </w:rPr>
-        <w:t xml:space="preserve">Bell Atl. Corp. v. Twombly</w:t>
-      </w:r>
-      <w:r>
-        <w:t xml:space="preserve">, 550 U.S. 544 (2007)</w:t>
-      </w:r>
-    </w:p>
-    <w:p>
-      <w:pPr>
-        <w:spacing w:before="0" w:after="240" w:line="240" w:lineRule="auto"/>
-        <w:ind w:left="360" w:firstLine="0"/>
-      </w:pPr>
-      <w:r>
-        <w:rPr>
-          <w:i/>
-        </w:rPr>
-        <w:t xml:space="preserve">Bernstein v. Extendicare Health Servs.</w:t>
-      </w:r>
-      <w:r>
-        <w:t xml:space="preserve">, 607 F. Supp. 2d 1027 (D. Minn. 2009)</w:t>
-      </w:r>
-    </w:p>
-    <w:p>
-      <w:pPr>
-        <w:spacing w:before="0" w:after="240" w:line="240" w:lineRule="auto"/>
-        <w:ind w:left="360" w:firstLine="0"/>
-      </w:pPr>
-      <w:r>
-        <w:rPr>
-          <w:i/>
-        </w:rPr>
-        <w:t xml:space="preserve">Futo v. U.S. Bancorp</w:t>
-      </w:r>
-      <w:r>
-        <w:t xml:space="preserve">, 826 F. Supp. 3d 1016 (D. Minn. 2026)</w:t>
-      </w:r>
-    </w:p>
-    <w:p>
-      <w:pPr>
-        <w:spacing w:before="0" w:after="240" w:line="240" w:lineRule="auto"/>
-        <w:ind w:left="360" w:firstLine="0"/>
-      </w:pPr>
-      <w:r>
-        <w:rPr>
-          <w:i/>
-        </w:rPr>
-        <w:t xml:space="preserve">ServiceMaster of St. Cloud v. GAB Bus. Servs., Inc.</w:t>
-      </w:r>
-      <w:r>
-        <w:t xml:space="preserve">, 544 N.W.2d 302 (Minn. 1996)</w:t>
-      </w:r>
-    </w:p>
-    <w:p>
-      <w:pPr>
-        <w:spacing w:before="0" w:after="240" w:line="240" w:lineRule="auto"/>
-        <w:ind w:left="360" w:firstLine="0"/>
-      </w:pPr>
-      <w:r>
-        <w:rPr>
-          <w:i/>
-        </w:rPr>
-        <w:t xml:space="preserve">Souter v. Edgewell Pers. Care Co.</w:t>
-      </w:r>
-      <w:r>
-        <w:t xml:space="preserve">, 542 F. Supp. 3d 1083 (S.D. Cal. 2021)</w:t>
-      </w:r>
-    </w:p>
-    <w:p>
-      <w:pPr>
-        <w:spacing w:before="0" w:after="240" w:line="240" w:lineRule="auto"/>
-        <w:ind w:left="360" w:firstLine="0"/>
-      </w:pPr>
-      <w:r>
-        <w:rPr>
-          <w:i/>
-        </w:rPr>
-        <w:t xml:space="preserve">United States v. Bestfoods</w:t>
-      </w:r>
-      <w:r>
-        <w:t xml:space="preserve">, 524 U.S. 51 (1998)</w:t>
-      </w:r>
-    </w:p>
-    <w:p>
-      <w:pPr>
-        <w:spacing w:before="0" w:after="240" w:line="240" w:lineRule="auto"/>
-        <w:ind w:left="360" w:firstLine="0"/>
-      </w:pPr>
-      <w:r>
-        <w:rPr>
-          <w:i/>
-        </w:rPr>
-        <w:t xml:space="preserve">Wright v. Capella Univ., Inc.</w:t>
-      </w:r>
-      <w:r>
-        <w:t xml:space="preserve">, 378 F. Supp. 3d 760 (D. Minn. 2019)</w:t>
-      </w:r>
-    </w:p>
-    <w:p>
-      <w:pPr>
-        <w:keepNext/>
-        <w:spacing w:before="240" w:after="240" w:line="240" w:lineRule="auto"/>
-      </w:pPr>
-      <w:r>
-        <w:rPr>
-          <w:b/>
-        </w:rPr>
-        <w:t xml:space="preserve">Rules:</w:t>
-      </w:r>
-    </w:p>
-    <w:p>
-      <w:pPr>
-        <w:spacing w:before="0" w:after="240" w:line="240" w:lineRule="auto"/>
-        <w:ind w:left="360" w:firstLine="0"/>
+        <w:t xml:space="preserve">Federal Rules</w:t>
+      </w:r>
+    </w:p>
+    <w:p>
+      <w:pPr>
+        <w:keepLines/>
+        <w:tabs>
+          <w:tab w:val="right" w:leader="dot" w:pos="8620"/>
+        </w:tabs>
+        <w:spacing w:before="0" w:after="120" w:line="240" w:lineRule="auto"/>
+        <w:ind w:left="504" w:right="1120" w:hanging="504"/>
       </w:pPr>
       <w:r>
         <w:t xml:space="preserve">Fed. R. Civ. P. 12(b)(6)</w:t>
       </w:r>
-    </w:p>
-    <w:p>
-      <w:pPr>
-        <w:spacing w:before="0" w:after="240" w:line="240" w:lineRule="auto"/>
-        <w:ind w:left="360" w:firstLine="0"/>
+      <w:r>
+        <w:t xml:space="preserve"> </w:t>
+      </w:r>
+      <w:r>
+        <w:tab/>
+      </w:r>
+      <w:r>
+        <w:t xml:space="preserve">3</w:t>
+      </w:r>
+    </w:p>
+    <w:p>
+      <w:pPr>
+        <w:keepLines/>
+        <w:tabs>
+          <w:tab w:val="right" w:leader="dot" w:pos="8620"/>
+        </w:tabs>
+        <w:spacing w:before="0" w:after="120" w:line="240" w:lineRule="auto"/>
+        <w:ind w:left="504" w:right="1120" w:hanging="504"/>
       </w:pPr>
       <w:r>
         <w:t xml:space="preserve">Fed. R. Civ. P. 12(e)</w:t>
       </w:r>
-    </w:p>
-    <w:p>
-      <w:pPr>
-        <w:spacing w:before="0" w:after="240" w:line="240" w:lineRule="auto"/>
-        <w:ind w:left="360" w:firstLine="0"/>
+      <w:r>
+        <w:t xml:space="preserve"> </w:t>
+      </w:r>
+      <w:r>
+        <w:tab/>
+      </w:r>
+      <w:r>
+        <w:t xml:space="preserve">3</w:t>
+      </w:r>
+    </w:p>
+    <w:p>
+      <w:pPr>
+        <w:keepLines/>
+        <w:tabs>
+          <w:tab w:val="right" w:leader="dot" w:pos="8620"/>
+        </w:tabs>
+        <w:spacing w:before="0" w:after="120" w:line="240" w:lineRule="auto"/>
+        <w:ind w:left="504" w:right="1120" w:hanging="504"/>
       </w:pPr>
       <w:r>
         <w:t xml:space="preserve">Fed. R. Civ. P. 8</w:t>
       </w:r>
-    </w:p>
-    <w:p>
-      <w:r>
-        <w:br w:type="page"/>
-      </w:r>
-    </w:p>
-    <w:bookmarkStart w:id="20" w:name="introduction"/>
+      <w:r>
+        <w:t xml:space="preserve"> </w:t>
+      </w:r>
+      <w:r>
+        <w:tab/>
+      </w:r>
+      <w:r>
+        <w:t xml:space="preserve">3, 4</w:t>
+      </w:r>
+    </w:p>
+    <w:p>
+      <w:pPr>
+        <w:suppressLineNumbers/>
+        <w:spacing w:before="0" w:after="0" w:line="20" w:lineRule="exact"/>
+        <w:sectPr>
+          <w:footerReference w:type="default" r:id="rIdCasdPage"/>
+          <w:footnotePr>
+            <w:numRestart w:val="eachSect"/>
+          </w:footnotePr>
+          <w:type w:val="nextPage"/>
+          <w:pgSz w:w="12240" w:h="15840"/>
+          <w:pgMar w:top="1440" w:right="1440" w:bottom="1440" w:left="2160" w:header="720" w:footer="120" w:gutter="0"/>
+          <w:pgBorders w:offsetFrom="text">
+            <w:left w:val="double" w:sz="4" w:space="14" w:color="auto"/>
+            <w:right w:val="single" w:sz="4" w:space="7" w:color="auto"/>
+          </w:pgBorders>
+          <w:lnNumType w:countBy="1" w:distance="720" w:restart="newPage"/>
+          <w:pgNumType w:fmt="lowerRoman" w:start="1"/>
+        </w:sectPr>
+      </w:pPr>
+    </w:p>
     <w:p>
       <w:pPr>
         <w:pStyle w:val="Heading1"/>
       </w:pPr>
+      <w:bookmarkStart w:id="9" w:name="_introduction"/>
       <w:r>
         <w:t xml:space="preserve">INTRODUCTION</w:t>
       </w:r>
+      <w:bookmarkEnd w:id="9"/>
     </w:p>
     <w:p>
       <w:pPr>
@@ -537,15 +912,15 @@
         <w:t xml:space="preserve">, 826 F. Supp. 3d 1016, 1039 (D. Minn. 2026) (dismissing similar cash sweep claims with prejudice).</w:t>
       </w:r>
     </w:p>
-    <w:bookmarkEnd w:id="20"/>
-    <w:bookmarkStart w:id="21" w:name="factual-background"/>
     <w:p>
       <w:pPr>
         <w:pStyle w:val="Heading1"/>
       </w:pPr>
+      <w:bookmarkStart w:id="10" w:name="_b8e5b8837ccf89115edfee2c48cc11b996d00ec"/>
       <w:r>
         <w:t xml:space="preserve">FACTUAL BACKGROUND</w:t>
       </w:r>
+      <w:bookmarkEnd w:id="10"/>
     </w:p>
     <w:p>
       <w:pPr>
@@ -643,15 +1018,15 @@
         <w:t xml:space="preserve">at ¶ 26. The interest rate paid to the customer depends on the amount deposited by tier (or group) of investment. Interest rates, deposit tiers, and CIS’s fees are publicly disclosed. Ex. A at 2, 4, 5, 8.</w:t>
       </w:r>
     </w:p>
-    <w:bookmarkEnd w:id="21"/>
-    <w:bookmarkStart w:id="22" w:name="standard-of-review"/>
     <w:p>
       <w:pPr>
         <w:pStyle w:val="Heading1"/>
       </w:pPr>
+      <w:bookmarkStart w:id="11" w:name="_9339ea4a612847623b5ac5d9b950ce636f60fb0"/>
       <w:r>
         <w:t xml:space="preserve">STANDARD OF REVIEW</w:t>
       </w:r>
+      <w:bookmarkEnd w:id="11"/>
     </w:p>
     <w:p>
       <w:pPr>
@@ -713,15 +1088,15 @@
         <w:t xml:space="preserve">, 536 F.3d 1049, 1055 (9th Cir. 2008)). As demonstrated below, Plaintiff’s complaint fails to state a claim under Rule 12(b)(6).</w:t>
       </w:r>
     </w:p>
-    <w:bookmarkEnd w:id="22"/>
-    <w:bookmarkStart w:id="23" w:name="argument"/>
     <w:p>
       <w:pPr>
         <w:pStyle w:val="Heading1"/>
       </w:pPr>
+      <w:bookmarkStart w:id="12" w:name="_argument"/>
       <w:r>
         <w:t xml:space="preserve">ARGUMENT</w:t>
       </w:r>
+      <w:bookmarkEnd w:id="12"/>
     </w:p>
     <w:p>
       <w:pPr>
@@ -956,19 +1331,19 @@
         <w:t xml:space="preserve">, Plaintiff’s as-pled claims illustrate that she received what she bargained for, which is interest on uninvested funds that would otherwise remain static.</w:t>
       </w:r>
     </w:p>
-    <w:bookmarkEnd w:id="23"/>
-    <w:bookmarkStart w:id="24" w:name="conclusion"/>
     <w:p>
       <w:pPr>
         <w:pStyle w:val="Heading1"/>
       </w:pPr>
+      <w:bookmarkStart w:id="13" w:name="_conclusion"/>
       <w:r>
         <w:t xml:space="preserve">CONCLUSION</w:t>
       </w:r>
-    </w:p>
-    <w:p>
-      <w:pPr>
-        <w:pStyle w:val="FirstParagraph"/>
+      <w:bookmarkEnd w:id="13"/>
+    </w:p>
+    <w:p>
+      <w:pPr>
+        <w:pStyle w:val="BodyKeep"/>
       </w:pPr>
       <w:r>
         <w:t xml:space="preserve">For the foregoing reasons, Defendants respectfully request that Plaintiff’s Complaint be dismissed in its entirety.</w:t>
@@ -1053,18 +1428,20 @@
         <w:t xml:space="preserve">Cetera Investment Services LLC</w:t>
       </w:r>
     </w:p>
-    <w:bookmarkEnd w:id="24"/>
     <w:sectPr>
+      <w:footerReference w:type="default" r:id="rIdCasdPage"/>
       <w:footnotePr>
         <w:numRestart w:val="eachSect"/>
       </w:footnotePr>
-      <w:pgSz w:h="15840" w:w="12240"/>
-      <w:pgMar w:bottom="960" w:footer="480" w:gutter="0" w:header="720" w:left="2160" w:right="1080" w:top="1440"/>
+      <w:type w:val="nextPage"/>
+      <w:pgSz w:w="12240" w:h="15840"/>
+      <w:pgMar w:top="1440" w:right="1440" w:bottom="1440" w:left="2160" w:header="720" w:footer="120" w:gutter="0"/>
       <w:pgBorders w:offsetFrom="text">
-        <w:left w:color="auto" w:space="14" w:sz="4" w:val="double"/>
-        <w:right w:color="auto" w:space="7" w:sz="4" w:val="single"/>
+        <w:left w:val="double" w:sz="4" w:space="14" w:color="auto"/>
+        <w:right w:val="single" w:sz="4" w:space="7" w:color="auto"/>
       </w:pgBorders>
-      <w:lnNumType w:countBy="1" w:distance="580" w:restart="newPage"/>
+      <w:lnNumType w:countBy="1" w:distance="720" w:restart="newPage"/>
+      <w:pgNumType w:fmt="decimal" w:start="1"/>
     </w:sectPr>
   </w:body>
 </w:document>
@@ -1091,6 +1468,181 @@
     </w:p>
   </w:footnote>
 </w:footnotes>
+</file>
+
+<file path=word/ftr-add.xml><?xml version="1.0" encoding="utf-8"?>
+<w:ftr xmlns:w="http://schemas.openxmlformats.org/wordprocessingml/2006/main" xmlns:r="http://schemas.openxmlformats.org/officeDocument/2006/relationships">
+  <w:p>
+    <w:pPr>
+      <w:spacing w:before="0" w:after="0"/>
+      <w:jc w:val="center"/>
+    </w:pPr>
+    <w:r>
+      <w:t>Add-</w:t>
+    </w:r>
+    <w:r>
+      <w:fldChar w:fldCharType="begin"/>
+    </w:r>
+    <w:r>
+      <w:instrText xml:space="preserve"> PAGE </w:instrText>
+    </w:r>
+    <w:r>
+      <w:fldChar w:fldCharType="separate"/>
+    </w:r>
+    <w:r>
+      <w:t>1</w:t>
+    </w:r>
+    <w:r>
+      <w:fldChar w:fldCharType="end"/>
+    </w:r>
+  </w:p>
+</w:ftr>
+</file>
+
+<file path=word/ftr-none.xml><?xml version="1.0" encoding="utf-8"?>
+<w:ftr xmlns:w="http://schemas.openxmlformats.org/wordprocessingml/2006/main" xmlns:r="http://schemas.openxmlformats.org/officeDocument/2006/relationships">
+  <w:p>
+    <w:pPr>
+      <w:spacing w:before="0" w:after="0"/>
+      <w:jc w:val="center"/>
+    </w:pPr>
+  </w:p>
+</w:ftr>
+</file>
+
+<file path=word/ftr-own1.xml><?xml version="1.0" encoding="utf-8"?>
+<w:ftr xmlns:w="http://schemas.openxmlformats.org/wordprocessingml/2006/main" xmlns:r="http://schemas.openxmlformats.org/officeDocument/2006/relationships">
+  <w:p>
+    <w:pPr>
+      <w:suppressLineNumbers/>
+      <w:spacing w:before="0" w:after="0" w:line="240" w:lineRule="auto"/>
+      <w:ind w:firstLine="0"/>
+      <w:jc w:val="center"/>
+    </w:pPr>
+    <w:r>
+      <w:rPr>
+        <w:sz w:val="20"/>
+        <w:szCs w:val="20"/>
+      </w:rPr>
+      <w:t xml:space="preserve">MEMORANDUM OF POINTS AND AUTHORITIES I/S/O MOTION TO DISMISS</w:t>
+    </w:r>
+  </w:p>
+  <w:p>
+    <w:pPr>
+      <w:suppressLineNumbers/>
+      <w:spacing w:before="0" w:after="0" w:line="240" w:lineRule="auto"/>
+      <w:ind w:firstLine="0"/>
+      <w:jc w:val="center"/>
+    </w:pPr>
+    <w:r>
+      <w:rPr>
+        <w:sz w:val="20"/>
+        <w:szCs w:val="20"/>
+      </w:rPr>
+      <w:t xml:space="preserve">No. 3:26-cv-03372-RSH-VET</w:t>
+    </w:r>
+  </w:p>
+</w:ftr>
+</file>
+
+<file path=word/ftr-own2.xml><?xml version="1.0" encoding="utf-8"?>
+<w:ftr xmlns:w="http://schemas.openxmlformats.org/wordprocessingml/2006/main" xmlns:r="http://schemas.openxmlformats.org/officeDocument/2006/relationships">
+  <w:p>
+    <w:pPr>
+      <w:suppressLineNumbers/>
+      <w:spacing w:before="0" w:after="80" w:line="240" w:lineRule="auto"/>
+      <w:ind w:firstLine="0"/>
+      <w:jc w:val="center"/>
+    </w:pPr>
+    <w:r>
+      <w:rPr>
+        <w:sz w:val="20"/>
+      </w:rPr>
+      <w:fldChar w:fldCharType="begin"/>
+    </w:r>
+    <w:r>
+      <w:rPr>
+        <w:sz w:val="20"/>
+      </w:rPr>
+      <w:instrText xml:space="preserve"> PAGE </w:instrText>
+    </w:r>
+    <w:r>
+      <w:rPr>
+        <w:sz w:val="20"/>
+      </w:rPr>
+      <w:fldChar w:fldCharType="separate"/>
+    </w:r>
+    <w:r>
+      <w:rPr>
+        <w:sz w:val="20"/>
+        <w:szCs w:val="20"/>
+      </w:rPr>
+      <w:t xml:space="preserve">1</w:t>
+    </w:r>
+    <w:r>
+      <w:rPr>
+        <w:sz w:val="20"/>
+      </w:rPr>
+      <w:fldChar w:fldCharType="end"/>
+    </w:r>
+  </w:p>
+  <w:p>
+    <w:pPr>
+      <w:suppressLineNumbers/>
+      <w:spacing w:before="0" w:after="0" w:line="240" w:lineRule="auto"/>
+      <w:ind w:firstLine="0"/>
+      <w:jc w:val="center"/>
+    </w:pPr>
+    <w:r>
+      <w:rPr>
+        <w:sz w:val="20"/>
+        <w:szCs w:val="20"/>
+      </w:rPr>
+      <w:t xml:space="preserve">MEMORANDUM OF POINTS AND AUTHORITIES I/S/O MOTION TO DISMISS</w:t>
+    </w:r>
+  </w:p>
+  <w:p>
+    <w:pPr>
+      <w:suppressLineNumbers/>
+      <w:spacing w:before="0" w:after="0" w:line="240" w:lineRule="auto"/>
+      <w:ind w:firstLine="0"/>
+      <w:jc w:val="center"/>
+    </w:pPr>
+    <w:r>
+      <w:rPr>
+        <w:sz w:val="20"/>
+        <w:szCs w:val="20"/>
+      </w:rPr>
+      <w:t xml:space="preserve">No. 3:26-cv-03372-RSH-VET</w:t>
+    </w:r>
+  </w:p>
+</w:ftr>
+</file>
+
+<file path=word/ftr-page.xml><?xml version="1.0" encoding="utf-8"?>
+<w:ftr xmlns:w="http://schemas.openxmlformats.org/wordprocessingml/2006/main" xmlns:r="http://schemas.openxmlformats.org/officeDocument/2006/relationships">
+  <w:p>
+    <w:pPr>
+      <w:spacing w:before="0" w:after="0"/>
+      <w:jc w:val="center"/>
+    </w:pPr>
+    <w:r>
+      <w:fldChar w:fldCharType="begin"/>
+    </w:r>
+    <w:r>
+      <w:instrText xml:space="preserve"> PAGE </w:instrText>
+    </w:r>
+    <w:r>
+      <w:fldChar w:fldCharType="separate"/>
+    </w:r>
+    <w:r>
+      <w:t>1</w:t>
+    </w:r>
+    <w:r>
+      <w:fldChar w:fldCharType="end"/>
+    </w:r>
+  </w:p>
+</w:ftr>
 </file>
 
 <file path=word/numbering.xml><?xml version="1.0" encoding="utf-8"?>
@@ -1182,49 +1734,49 @@
   <w:docDefaults>
     <w:rPrDefault>
       <w:rPr>
-        <w:rFonts w:ascii="EB Garamond" w:cs="EB Garamond" w:eastAsia="EB Garamond" w:hAnsi="EB Garamond"/>
+        <w:rFonts w:ascii="Times New Roman" w:hAnsi="Times New Roman" w:eastAsia="Times New Roman" w:cs="Times New Roman"/>
         <w:sz w:val="28"/>
         <w:szCs w:val="28"/>
-        <w:lang w:bidi="ar-SA" w:eastAsia="en-US" w:val="en-US"/>
+        <w:lang w:val="en-US" w:eastAsia="zh-CN" w:bidi="ar-SA"/>
       </w:rPr>
     </w:rPrDefault>
     <w:pPrDefault>
       <w:pPr>
-        <w:spacing w:after="0" w:before="0" w:line="480" w:lineRule="exact"/>
+        <w:spacing w:before="0" w:after="0" w:line="480" w:lineRule="exact"/>
       </w:pPr>
     </w:pPrDefault>
   </w:docDefaults>
-  <w:latentStyles w:count="276" w:defLockedState="0" w:defQFormat="0" w:defSemiHidden="0" w:defUIPriority="0" w:defUnhideWhenUsed="0"/>
-  <w:style w:default="1" w:styleId="Normal" w:type="paragraph">
+  <w:latentStyles w:defLockedState="0" w:defUIPriority="0" w:defSemiHidden="0" w:defUnhideWhenUsed="0" w:defQFormat="0" w:count="276"/>
+  <w:style w:type="paragraph" w:default="1" w:styleId="Normal">
     <w:name w:val="Normal"/>
     <w:qFormat/>
   </w:style>
-  <w:style w:styleId="BodyText" w:type="paragraph">
+  <w:style w:type="paragraph" w:styleId="BodyText">
     <w:name w:val="Body Text"/>
     <w:basedOn w:val="Normal"/>
     <w:link w:val="BodyTextChar"/>
     <w:qFormat/>
     <w:pPr>
-      <w:spacing w:after="0" w:before="0" w:line="480" w:lineRule="exact"/>
+      <w:spacing w:before="0" w:after="0" w:line="480" w:lineRule="exact"/>
       <w:ind w:firstLine="720"/>
     </w:pPr>
   </w:style>
-  <w:style w:customStyle="1" w:styleId="FirstParagraph" w:type="paragraph">
+  <w:style w:type="paragraph" w:customStyle="1" w:styleId="FirstParagraph">
     <w:name w:val="First Paragraph"/>
     <w:basedOn w:val="BodyText"/>
     <w:next w:val="BodyText"/>
     <w:qFormat/>
   </w:style>
-  <w:style w:customStyle="1" w:styleId="Compact" w:type="paragraph">
+  <w:style w:type="paragraph" w:customStyle="1" w:styleId="Compact">
     <w:name w:val="Compact"/>
     <w:basedOn w:val="BodyText"/>
     <w:qFormat/>
     <w:pPr>
-      <w:spacing w:after="0" w:before="0" w:line="480" w:lineRule="exact"/>
+      <w:spacing w:before="0" w:after="0" w:line="480" w:lineRule="exact"/>
       <w:ind w:firstLine="0"/>
     </w:pPr>
   </w:style>
-  <w:style w:styleId="Title" w:type="paragraph">
+  <w:style w:type="paragraph" w:styleId="Title">
     <w:name w:val="Title"/>
     <w:basedOn w:val="Normal"/>
     <w:next w:val="BodyText"/>
@@ -1238,24 +1790,24 @@
       <w:jc w:val="center"/>
     </w:pPr>
     <w:rPr>
-      <w:rFonts w:ascii="EB Garamond" w:cs="EB Garamond" w:eastAsia="EB Garamond" w:hAnsi="EB Garamond"/>
+      <w:rFonts w:ascii="Times New Roman" w:hAnsi="Times New Roman" w:eastAsia="Times New Roman" w:cs="Times New Roman"/>
       <w:sz w:val="28"/>
       <w:szCs w:val="28"/>
     </w:rPr>
   </w:style>
-  <w:style w:customStyle="1" w:styleId="TitleChar" w:type="character">
+  <w:style w:type="character" w:customStyle="1" w:styleId="TitleChar">
     <w:name w:val="Title Char"/>
     <w:basedOn w:val="DefaultParagraphFont"/>
     <w:link w:val="Title"/>
     <w:uiPriority w:val="10"/>
     <w:rsid w:val="00A10FD9"/>
     <w:rPr>
-      <w:rFonts w:ascii="EB Garamond" w:cs="EB Garamond" w:eastAsia="EB Garamond" w:hAnsi="EB Garamond"/>
+      <w:rFonts w:ascii="Times New Roman" w:hAnsi="Times New Roman" w:eastAsia="Times New Roman" w:cs="Times New Roman"/>
       <w:sz w:val="28"/>
       <w:szCs w:val="28"/>
     </w:rPr>
   </w:style>
-  <w:style w:styleId="Subtitle" w:type="paragraph">
+  <w:style w:type="paragraph" w:styleId="Subtitle">
     <w:name w:val="Subtitle"/>
     <w:basedOn w:val="Title"/>
     <w:next w:val="BodyText"/>
@@ -1269,27 +1821,27 @@
       </w:numPr>
     </w:pPr>
     <w:rPr>
-      <w:rFonts w:ascii="EB Garamond" w:cs="EB Garamond" w:eastAsia="EB Garamond" w:hAnsi="EB Garamond"/>
+      <w:rFonts w:ascii="Times New Roman" w:hAnsi="Times New Roman" w:eastAsia="Times New Roman" w:cs="Times New Roman"/>
       <w:spacing w:val="15"/>
       <w:sz w:val="28"/>
       <w:szCs w:val="28"/>
     </w:rPr>
   </w:style>
-  <w:style w:customStyle="1" w:styleId="SubtitleChar" w:type="character">
+  <w:style w:type="character" w:customStyle="1" w:styleId="SubtitleChar">
     <w:name w:val="Subtitle Char"/>
     <w:basedOn w:val="DefaultParagraphFont"/>
     <w:link w:val="Subtitle"/>
     <w:uiPriority w:val="11"/>
     <w:rsid w:val="00A10FD9"/>
     <w:rPr>
-      <w:rFonts w:ascii="EB Garamond" w:cs="EB Garamond" w:eastAsia="EB Garamond" w:hAnsi="EB Garamond"/>
+      <w:rFonts w:ascii="Times New Roman" w:hAnsi="Times New Roman" w:eastAsia="Times New Roman" w:cs="Times New Roman"/>
       <w:color w:val="000000"/>
       <w:spacing w:val="15"/>
       <w:sz w:val="28"/>
       <w:szCs w:val="28"/>
     </w:rPr>
   </w:style>
-  <w:style w:customStyle="1" w:styleId="Author" w:type="paragraph">
+  <w:style w:type="paragraph" w:customStyle="1" w:styleId="Author">
     <w:name w:val="Author"/>
     <w:basedOn w:val="Title"/>
     <w:next w:val="BodyText"/>
@@ -1303,7 +1855,7 @@
       <w:szCs w:val="28"/>
     </w:rPr>
   </w:style>
-  <w:style w:styleId="Date" w:type="paragraph">
+  <w:style w:type="paragraph" w:styleId="Date">
     <w:name w:val="Date"/>
     <w:basedOn w:val="Title"/>
     <w:next w:val="BodyText"/>
@@ -1317,7 +1869,7 @@
       <w:szCs w:val="28"/>
     </w:rPr>
   </w:style>
-  <w:style w:customStyle="1" w:styleId="AbstractTitle" w:type="paragraph">
+  <w:style w:type="paragraph" w:customStyle="1" w:styleId="AbstractTitle">
     <w:name w:val="Abstract Title"/>
     <w:basedOn w:val="Normal"/>
     <w:next w:val="Abstract"/>
@@ -1325,7 +1877,7 @@
     <w:pPr>
       <w:keepNext/>
       <w:keepLines/>
-      <w:spacing w:after="0" w:before="300"/>
+      <w:spacing w:before="300" w:after="0"/>
       <w:jc w:val="center"/>
     </w:pPr>
     <w:rPr>
@@ -1334,7 +1886,7 @@
       <w:szCs w:val="28"/>
     </w:rPr>
   </w:style>
-  <w:style w:customStyle="1" w:styleId="Abstract" w:type="paragraph">
+  <w:style w:type="paragraph" w:customStyle="1" w:styleId="Abstract">
     <w:name w:val="Abstract"/>
     <w:basedOn w:val="Normal"/>
     <w:next w:val="BodyText"/>
@@ -1342,14 +1894,14 @@
     <w:pPr>
       <w:keepNext/>
       <w:keepLines/>
-      <w:spacing w:after="300" w:before="100"/>
+      <w:spacing w:before="100" w:after="300"/>
     </w:pPr>
     <w:rPr>
       <w:sz w:val="28"/>
       <w:szCs w:val="28"/>
     </w:rPr>
   </w:style>
-  <w:style w:styleId="Bibliography" w:type="paragraph">
+  <w:style w:type="paragraph" w:styleId="Bibliography">
     <w:name w:val="Bibliography"/>
     <w:basedOn w:val="Normal"/>
     <w:next w:val="Bibliography"/>
@@ -1357,7 +1909,7 @@
     <w:pPr/>
     <w:rPr/>
   </w:style>
-  <w:style w:styleId="Heading1" w:type="paragraph">
+  <w:style w:type="paragraph" w:styleId="Heading1">
     <w:name w:val="heading 1"/>
     <w:basedOn w:val="Normal"/>
     <w:next w:val="BodyText"/>
@@ -1368,19 +1920,19 @@
     <w:pPr>
       <w:keepNext/>
       <w:keepLines/>
-      <w:spacing w:after="0" w:before="0" w:line="480" w:lineRule="exact"/>
+      <w:spacing w:before="0" w:after="0" w:line="480" w:lineRule="exact"/>
       <w:jc w:val="center"/>
       <w:outlineLvl w:val="0"/>
     </w:pPr>
     <w:rPr>
-      <w:rFonts w:ascii="EB Garamond" w:cs="EB Garamond" w:eastAsia="EB Garamond" w:hAnsi="EB Garamond"/>
+      <w:rFonts w:ascii="Times New Roman" w:hAnsi="Times New Roman" w:eastAsia="Times New Roman" w:cs="Times New Roman"/>
       <w:b/>
       <w:color w:val="000000"/>
       <w:sz w:val="28"/>
       <w:szCs w:val="28"/>
     </w:rPr>
   </w:style>
-  <w:style w:styleId="Heading2" w:type="paragraph">
+  <w:style w:type="paragraph" w:styleId="Heading2">
     <w:name w:val="heading 2"/>
     <w:basedOn w:val="Normal"/>
     <w:next w:val="BodyText"/>
@@ -1393,19 +1945,19 @@
     <w:pPr>
       <w:keepNext/>
       <w:keepLines/>
-      <w:spacing w:after="0" w:before="0" w:line="480" w:lineRule="exact"/>
-      <w:ind w:hanging="720" w:left="720"/>
+      <w:spacing w:before="0" w:after="0" w:line="480" w:lineRule="exact"/>
+      <w:ind w:left="720" w:hanging="720"/>
       <w:outlineLvl w:val="1"/>
     </w:pPr>
     <w:rPr>
-      <w:rFonts w:ascii="EB Garamond" w:cs="EB Garamond" w:eastAsia="EB Garamond" w:hAnsi="EB Garamond"/>
+      <w:rFonts w:ascii="Times New Roman" w:hAnsi="Times New Roman" w:eastAsia="Times New Roman" w:cs="Times New Roman"/>
       <w:b/>
       <w:color w:val="000000"/>
       <w:sz w:val="28"/>
       <w:szCs w:val="28"/>
     </w:rPr>
   </w:style>
-  <w:style w:styleId="Heading3" w:type="paragraph">
+  <w:style w:type="paragraph" w:styleId="Heading3">
     <w:name w:val="heading 3"/>
     <w:basedOn w:val="Normal"/>
     <w:next w:val="BodyText"/>
@@ -1418,12 +1970,12 @@
     <w:pPr>
       <w:keepNext/>
       <w:keepLines/>
-      <w:spacing w:after="0" w:before="0" w:line="480" w:lineRule="exact"/>
-      <w:ind w:hanging="720" w:left="1440"/>
+      <w:spacing w:before="0" w:after="0" w:line="480" w:lineRule="exact"/>
+      <w:ind w:left="1440" w:hanging="720"/>
       <w:outlineLvl w:val="2"/>
     </w:pPr>
     <w:rPr>
-      <w:rFonts w:ascii="EB Garamond" w:cs="EB Garamond" w:eastAsia="EB Garamond" w:hAnsi="EB Garamond"/>
+      <w:rFonts w:ascii="Times New Roman" w:hAnsi="Times New Roman" w:eastAsia="Times New Roman" w:cs="Times New Roman"/>
       <w:b/>
       <w:i/>
       <w:color w:val="000000"/>
@@ -1431,7 +1983,7 @@
       <w:szCs w:val="28"/>
     </w:rPr>
   </w:style>
-  <w:style w:styleId="Heading4" w:type="paragraph">
+  <w:style w:type="paragraph" w:styleId="Heading4">
     <w:name w:val="heading 4"/>
     <w:basedOn w:val="Normal"/>
     <w:next w:val="BodyText"/>
@@ -1444,17 +1996,17 @@
     <w:pPr>
       <w:keepNext/>
       <w:keepLines/>
-      <w:spacing w:after="40" w:before="80"/>
+      <w:spacing w:before="80" w:after="40"/>
       <w:outlineLvl w:val="3"/>
     </w:pPr>
     <w:rPr>
-      <w:rFonts w:ascii="EB Garamond" w:cs="EB Garamond" w:eastAsia="EB Garamond" w:hAnsi="EB Garamond"/>
+      <w:rFonts w:ascii="Times New Roman" w:hAnsi="Times New Roman" w:eastAsia="Times New Roman" w:cs="Times New Roman"/>
       <w:i/>
       <w:iCs/>
       <w:color w:val="000000"/>
     </w:rPr>
   </w:style>
-  <w:style w:styleId="Heading5" w:type="paragraph">
+  <w:style w:type="paragraph" w:styleId="Heading5">
     <w:name w:val="heading 5"/>
     <w:basedOn w:val="Normal"/>
     <w:next w:val="BodyText"/>
@@ -1467,15 +2019,15 @@
     <w:pPr>
       <w:keepNext/>
       <w:keepLines/>
-      <w:spacing w:after="40" w:before="80"/>
+      <w:spacing w:before="80" w:after="40"/>
       <w:outlineLvl w:val="4"/>
     </w:pPr>
     <w:rPr>
-      <w:rFonts w:ascii="EB Garamond" w:cs="EB Garamond" w:eastAsia="EB Garamond" w:hAnsi="EB Garamond"/>
+      <w:rFonts w:ascii="Times New Roman" w:hAnsi="Times New Roman" w:eastAsia="Times New Roman" w:cs="Times New Roman"/>
       <w:color w:val="000000"/>
     </w:rPr>
   </w:style>
-  <w:style w:styleId="Heading6" w:type="paragraph">
+  <w:style w:type="paragraph" w:styleId="Heading6">
     <w:name w:val="heading 6"/>
     <w:basedOn w:val="Normal"/>
     <w:next w:val="BodyText"/>
@@ -1488,17 +2040,17 @@
     <w:pPr>
       <w:keepNext/>
       <w:keepLines/>
-      <w:spacing w:after="0" w:before="40"/>
+      <w:spacing w:before="40" w:after="0"/>
       <w:outlineLvl w:val="5"/>
     </w:pPr>
     <w:rPr>
-      <w:rFonts w:ascii="EB Garamond" w:cs="EB Garamond" w:eastAsia="EB Garamond" w:hAnsi="EB Garamond"/>
+      <w:rFonts w:ascii="Times New Roman" w:hAnsi="Times New Roman" w:eastAsia="Times New Roman" w:cs="Times New Roman"/>
       <w:i/>
       <w:iCs/>
       <w:color w:val="000000"/>
     </w:rPr>
   </w:style>
-  <w:style w:styleId="Heading7" w:type="paragraph">
+  <w:style w:type="paragraph" w:styleId="Heading7">
     <w:name w:val="heading 7"/>
     <w:basedOn w:val="Normal"/>
     <w:next w:val="BodyText"/>
@@ -1511,15 +2063,15 @@
     <w:pPr>
       <w:keepNext/>
       <w:keepLines/>
-      <w:spacing w:after="0" w:before="40"/>
+      <w:spacing w:before="40" w:after="0"/>
       <w:outlineLvl w:val="6"/>
     </w:pPr>
     <w:rPr>
-      <w:rFonts w:ascii="EB Garamond" w:cs="EB Garamond" w:eastAsia="EB Garamond" w:hAnsi="EB Garamond"/>
+      <w:rFonts w:ascii="Times New Roman" w:hAnsi="Times New Roman" w:eastAsia="Times New Roman" w:cs="Times New Roman"/>
       <w:color w:val="000000"/>
     </w:rPr>
   </w:style>
-  <w:style w:styleId="Heading8" w:type="paragraph">
+  <w:style w:type="paragraph" w:styleId="Heading8">
     <w:name w:val="heading 8"/>
     <w:basedOn w:val="Normal"/>
     <w:next w:val="BodyText"/>
@@ -1536,13 +2088,13 @@
       <w:outlineLvl w:val="7"/>
     </w:pPr>
     <w:rPr>
-      <w:rFonts w:ascii="EB Garamond" w:cs="EB Garamond" w:eastAsia="EB Garamond" w:hAnsi="EB Garamond"/>
+      <w:rFonts w:ascii="Times New Roman" w:hAnsi="Times New Roman" w:eastAsia="Times New Roman" w:cs="Times New Roman"/>
       <w:i/>
       <w:iCs/>
       <w:color w:val="000000"/>
     </w:rPr>
   </w:style>
-  <w:style w:styleId="Heading9" w:type="paragraph">
+  <w:style w:type="paragraph" w:styleId="Heading9">
     <w:name w:val="heading 9"/>
     <w:basedOn w:val="Normal"/>
     <w:next w:val="BodyText"/>
@@ -1559,24 +2111,24 @@
       <w:outlineLvl w:val="8"/>
     </w:pPr>
     <w:rPr>
-      <w:rFonts w:ascii="EB Garamond" w:cs="EB Garamond" w:eastAsia="EB Garamond" w:hAnsi="EB Garamond"/>
+      <w:rFonts w:ascii="Times New Roman" w:hAnsi="Times New Roman" w:eastAsia="Times New Roman" w:cs="Times New Roman"/>
       <w:color w:val="000000"/>
     </w:rPr>
   </w:style>
-  <w:style w:customStyle="1" w:styleId="Heading1Char" w:type="character">
+  <w:style w:type="character" w:customStyle="1" w:styleId="Heading1Char">
     <w:name w:val="Heading 1 Char"/>
     <w:basedOn w:val="DefaultParagraphFont"/>
     <w:link w:val="Heading1"/>
     <w:uiPriority w:val="9"/>
     <w:rsid w:val="00A10FD9"/>
     <w:rPr>
-      <w:rFonts w:ascii="EB Garamond" w:cs="EB Garamond" w:eastAsia="EB Garamond" w:hAnsi="EB Garamond"/>
+      <w:rFonts w:ascii="Times New Roman" w:hAnsi="Times New Roman" w:eastAsia="Times New Roman" w:cs="Times New Roman"/>
       <w:color w:val="000000"/>
       <w:sz w:val="28"/>
       <w:szCs w:val="28"/>
     </w:rPr>
   </w:style>
-  <w:style w:customStyle="1" w:styleId="Heading2Char" w:type="character">
+  <w:style w:type="character" w:customStyle="1" w:styleId="Heading2Char">
     <w:name w:val="Heading 2 Char"/>
     <w:basedOn w:val="DefaultParagraphFont"/>
     <w:link w:val="Heading2"/>
@@ -1584,13 +2136,13 @@
     <w:semiHidden/>
     <w:rsid w:val="00A10FD9"/>
     <w:rPr>
-      <w:rFonts w:ascii="EB Garamond" w:cs="EB Garamond" w:eastAsia="EB Garamond" w:hAnsi="EB Garamond"/>
+      <w:rFonts w:ascii="Times New Roman" w:hAnsi="Times New Roman" w:eastAsia="Times New Roman" w:cs="Times New Roman"/>
       <w:color w:val="000000"/>
       <w:sz w:val="28"/>
       <w:szCs w:val="28"/>
     </w:rPr>
   </w:style>
-  <w:style w:customStyle="1" w:styleId="Heading3Char" w:type="character">
+  <w:style w:type="character" w:customStyle="1" w:styleId="Heading3Char">
     <w:name w:val="Heading 3 Char"/>
     <w:basedOn w:val="DefaultParagraphFont"/>
     <w:link w:val="Heading3"/>
@@ -1598,13 +2150,13 @@
     <w:semiHidden/>
     <w:rsid w:val="00A10FD9"/>
     <w:rPr>
-      <w:rFonts w:ascii="EB Garamond" w:cs="EB Garamond" w:eastAsia="EB Garamond" w:hAnsi="EB Garamond"/>
+      <w:rFonts w:ascii="Times New Roman" w:hAnsi="Times New Roman" w:eastAsia="Times New Roman" w:cs="Times New Roman"/>
       <w:color w:val="000000"/>
       <w:sz w:val="28"/>
       <w:szCs w:val="28"/>
     </w:rPr>
   </w:style>
-  <w:style w:customStyle="1" w:styleId="Heading4Char" w:type="character">
+  <w:style w:type="character" w:customStyle="1" w:styleId="Heading4Char">
     <w:name w:val="Heading 4 Char"/>
     <w:basedOn w:val="DefaultParagraphFont"/>
     <w:link w:val="Heading4"/>
@@ -1612,13 +2164,13 @@
     <w:semiHidden/>
     <w:rsid w:val="00A10FD9"/>
     <w:rPr>
-      <w:rFonts w:ascii="EB Garamond" w:cs="EB Garamond" w:eastAsia="EB Garamond" w:hAnsi="EB Garamond"/>
+      <w:rFonts w:ascii="Times New Roman" w:hAnsi="Times New Roman" w:eastAsia="Times New Roman" w:cs="Times New Roman"/>
       <w:i/>
       <w:iCs/>
       <w:color w:val="000000"/>
     </w:rPr>
   </w:style>
-  <w:style w:customStyle="1" w:styleId="Heading5Char" w:type="character">
+  <w:style w:type="character" w:customStyle="1" w:styleId="Heading5Char">
     <w:name w:val="Heading 5 Char"/>
     <w:basedOn w:val="DefaultParagraphFont"/>
     <w:link w:val="Heading5"/>
@@ -1626,11 +2178,11 @@
     <w:semiHidden/>
     <w:rsid w:val="00A10FD9"/>
     <w:rPr>
-      <w:rFonts w:ascii="EB Garamond" w:cs="EB Garamond" w:eastAsia="EB Garamond" w:hAnsi="EB Garamond"/>
+      <w:rFonts w:ascii="Times New Roman" w:hAnsi="Times New Roman" w:eastAsia="Times New Roman" w:cs="Times New Roman"/>
       <w:color w:val="000000"/>
     </w:rPr>
   </w:style>
-  <w:style w:customStyle="1" w:styleId="Heading6Char" w:type="character">
+  <w:style w:type="character" w:customStyle="1" w:styleId="Heading6Char">
     <w:name w:val="Heading 6 Char"/>
     <w:basedOn w:val="DefaultParagraphFont"/>
     <w:link w:val="Heading6"/>
@@ -1638,13 +2190,13 @@
     <w:semiHidden/>
     <w:rsid w:val="00A10FD9"/>
     <w:rPr>
-      <w:rFonts w:ascii="EB Garamond" w:cs="EB Garamond" w:eastAsia="EB Garamond" w:hAnsi="EB Garamond"/>
+      <w:rFonts w:ascii="Times New Roman" w:hAnsi="Times New Roman" w:eastAsia="Times New Roman" w:cs="Times New Roman"/>
       <w:i/>
       <w:iCs/>
       <w:color w:val="000000"/>
     </w:rPr>
   </w:style>
-  <w:style w:customStyle="1" w:styleId="Heading7Char" w:type="character">
+  <w:style w:type="character" w:customStyle="1" w:styleId="Heading7Char">
     <w:name w:val="Heading 7 Char"/>
     <w:basedOn w:val="DefaultParagraphFont"/>
     <w:link w:val="Heading7"/>
@@ -1652,11 +2204,11 @@
     <w:semiHidden/>
     <w:rsid w:val="00A10FD9"/>
     <w:rPr>
-      <w:rFonts w:ascii="EB Garamond" w:cs="EB Garamond" w:eastAsia="EB Garamond" w:hAnsi="EB Garamond"/>
+      <w:rFonts w:ascii="Times New Roman" w:hAnsi="Times New Roman" w:eastAsia="Times New Roman" w:cs="Times New Roman"/>
       <w:color w:val="000000"/>
     </w:rPr>
   </w:style>
-  <w:style w:customStyle="1" w:styleId="Heading8Char" w:type="character">
+  <w:style w:type="character" w:customStyle="1" w:styleId="Heading8Char">
     <w:name w:val="Heading 8 Char"/>
     <w:basedOn w:val="DefaultParagraphFont"/>
     <w:link w:val="Heading8"/>
@@ -1664,13 +2216,13 @@
     <w:semiHidden/>
     <w:rsid w:val="00A10FD9"/>
     <w:rPr>
-      <w:rFonts w:ascii="EB Garamond" w:cs="EB Garamond" w:eastAsia="EB Garamond" w:hAnsi="EB Garamond"/>
+      <w:rFonts w:ascii="Times New Roman" w:hAnsi="Times New Roman" w:eastAsia="Times New Roman" w:cs="Times New Roman"/>
       <w:i/>
       <w:iCs/>
       <w:color w:val="000000"/>
     </w:rPr>
   </w:style>
-  <w:style w:customStyle="1" w:styleId="Heading9Char" w:type="character">
+  <w:style w:type="character" w:customStyle="1" w:styleId="Heading9Char">
     <w:name w:val="Heading 9 Char"/>
     <w:basedOn w:val="DefaultParagraphFont"/>
     <w:link w:val="Heading9"/>
@@ -1678,11 +2230,11 @@
     <w:semiHidden/>
     <w:rsid w:val="00A10FD9"/>
     <w:rPr>
-      <w:rFonts w:ascii="EB Garamond" w:cs="EB Garamond" w:eastAsia="EB Garamond" w:hAnsi="EB Garamond"/>
+      <w:rFonts w:ascii="Times New Roman" w:hAnsi="Times New Roman" w:eastAsia="Times New Roman" w:cs="Times New Roman"/>
       <w:color w:val="000000"/>
     </w:rPr>
   </w:style>
-  <w:style w:styleId="BlockText" w:type="paragraph">
+  <w:style w:type="paragraph" w:styleId="BlockText">
     <w:name w:val="Block Text"/>
     <w:basedOn w:val="BodyText"/>
     <w:next w:val="BodyText"/>
@@ -1690,11 +2242,11 @@
     <w:unhideWhenUsed/>
     <w:qFormat/>
     <w:pPr>
-      <w:spacing w:after="0" w:before="0" w:line="480" w:lineRule="exact"/>
+      <w:spacing w:before="0" w:after="0" w:line="480" w:lineRule="exact"/>
       <w:ind w:firstLine="0" w:left="480" w:right="480"/>
     </w:pPr>
   </w:style>
-  <w:style w:styleId="FootnoteText" w:type="paragraph">
+  <w:style w:type="paragraph" w:styleId="FootnoteText">
     <w:name w:val="Footnote Text"/>
     <w:basedOn w:val="Normal"/>
     <w:next w:val="FootnoteText"/>
@@ -1702,10 +2254,10 @@
     <w:unhideWhenUsed/>
     <w:qFormat/>
     <w:pPr>
-      <w:spacing w:after="120" w:before="0" w:line="240" w:lineRule="auto"/>
-    </w:pPr>
-  </w:style>
-  <w:style w:styleId="FootnoteBlockText" w:type="paragraph">
+      <w:spacing w:before="0" w:after="120" w:line="240" w:lineRule="auto"/>
+    </w:pPr>
+  </w:style>
+  <w:style w:type="paragraph" w:styleId="FootnoteBlockText">
     <w:name w:val="Footnote Block Text"/>
     <w:basedOn w:val="FootnoteText"/>
     <w:next w:val="FootnoteText"/>
@@ -1713,38 +2265,29 @@
     <w:unhideWhenUsed/>
     <w:qFormat/>
     <w:pPr>
-      <w:spacing w:after="100" w:before="100"/>
+      <w:spacing w:before="100" w:after="100"/>
       <w:ind w:firstLine="0" w:left="480" w:right="480"/>
     </w:pPr>
   </w:style>
-  <w:style w:default="1" w:styleId="DefaultParagraphFont" w:type="character">
+  <w:style w:type="character" w:default="1" w:styleId="DefaultParagraphFont">
     <w:name w:val="Default Paragraph Font"/>
     <w:semiHidden/>
     <w:unhideWhenUsed/>
   </w:style>
-  <w:style w:default="1" w:styleId="Table" w:type="table">
+  <w:style w:type="table" w:default="1" w:styleId="Table">
     <w:name w:val="Table"/>
     <w:basedOn w:val="TableNormal"/>
-    <w:semiHidden/>
-    <w:unhideWhenUsed/>
     <w:qFormat/>
     <w:tblPr>
-      <w:tblInd w:type="dxa" w:w="0"/>
+      <w:tblInd w:w="0" w:type="dxa"/>
       <w:tblCellMar>
-        <w:top w:type="dxa" w:w="0"/>
-        <w:left w:type="dxa" w:w="108"/>
-        <w:bottom w:type="dxa" w:w="0"/>
-        <w:right w:type="dxa" w:w="108"/>
+        <w:top w:w="0" w:type="dxa"/>
+        <w:left w:w="108" w:type="dxa"/>
+        <w:bottom w:w="0" w:type="dxa"/>
+        <w:right w:w="108" w:type="dxa"/>
       </w:tblCellMar>
     </w:tblPr>
     <w:tblStylePr w:type="firstRow">
-      <w:tblPr>
-        <w:jc w:val="left"/>
-        <w:tblInd w:type="dxa" w:w="0"/>
-      </w:tblPr>
-      <w:trPr>
-        <w:jc w:val="left"/>
-      </w:trPr>
       <w:tcPr>
         <w:tcBorders>
           <w:bottom w:val="single"/>
@@ -1753,7 +2296,7 @@
       </w:tcPr>
     </w:tblStylePr>
   </w:style>
-  <w:style w:customStyle="1" w:styleId="DefinitionTerm" w:type="paragraph">
+  <w:style w:type="paragraph" w:customStyle="1" w:styleId="DefinitionTerm">
     <w:name w:val="Definition Term"/>
     <w:basedOn w:val="Normal"/>
     <w:next w:val="Definition"/>
@@ -1766,75 +2309,75 @@
       <w:b/>
     </w:rPr>
   </w:style>
-  <w:style w:customStyle="1" w:styleId="Definition" w:type="paragraph">
+  <w:style w:type="paragraph" w:customStyle="1" w:styleId="Definition">
     <w:name w:val="Definition"/>
     <w:basedOn w:val="Normal"/>
   </w:style>
-  <w:style w:styleId="Caption" w:type="paragraph">
+  <w:style w:type="paragraph" w:styleId="Caption">
     <w:name w:val="Caption"/>
     <w:basedOn w:val="Normal"/>
     <w:link w:val="BodyTextChar"/>
     <w:pPr>
-      <w:spacing w:after="120" w:before="0"/>
+      <w:spacing w:before="0" w:after="120"/>
     </w:pPr>
     <w:rPr>
       <w:i/>
     </w:rPr>
   </w:style>
-  <w:style w:customStyle="1" w:styleId="TableCaption" w:type="paragraph">
+  <w:style w:type="paragraph" w:customStyle="1" w:styleId="TableCaption">
     <w:name w:val="Table Caption"/>
     <w:basedOn w:val="Caption"/>
     <w:pPr>
       <w:keepNext/>
     </w:pPr>
   </w:style>
-  <w:style w:customStyle="1" w:styleId="ImageCaption" w:type="paragraph">
+  <w:style w:type="paragraph" w:customStyle="1" w:styleId="ImageCaption">
     <w:name w:val="Image Caption"/>
     <w:basedOn w:val="Caption"/>
   </w:style>
-  <w:style w:customStyle="1" w:styleId="Figure" w:type="paragraph">
+  <w:style w:type="paragraph" w:customStyle="1" w:styleId="Figure">
     <w:name w:val="Figure"/>
     <w:basedOn w:val="Normal"/>
   </w:style>
-  <w:style w:customStyle="1" w:styleId="CaptionedFigure" w:type="paragraph">
+  <w:style w:type="paragraph" w:customStyle="1" w:styleId="CaptionedFigure">
     <w:name w:val="Captioned Figure"/>
     <w:basedOn w:val="Figure"/>
     <w:pPr>
       <w:keepNext/>
     </w:pPr>
   </w:style>
-  <w:style w:customStyle="1" w:styleId="BodyTextChar" w:type="character">
+  <w:style w:type="character" w:customStyle="1" w:styleId="BodyTextChar">
     <w:name w:val="Body Text Char"/>
     <w:basedOn w:val="DefaultParagraphFont"/>
     <w:link w:val="BodyText"/>
   </w:style>
-  <w:style w:customStyle="1" w:styleId="VerbatimChar" w:type="character">
+  <w:style w:type="character" w:customStyle="1" w:styleId="VerbatimChar">
     <w:name w:val="Verbatim Char"/>
     <w:basedOn w:val="BodyTextChar"/>
     <w:rPr>
-      <w:rFonts w:ascii="EB Garamond" w:cs="EB Garamond" w:eastAsia="EB Garamond" w:hAnsi="EB Garamond"/>
+      <w:rFonts w:ascii="Times New Roman" w:hAnsi="Times New Roman" w:eastAsia="Times New Roman" w:cs="Times New Roman"/>
       <w:sz w:val="28"/>
     </w:rPr>
   </w:style>
-  <w:style w:customStyle="1" w:styleId="SectionNumber" w:type="character">
+  <w:style w:type="character" w:customStyle="1" w:styleId="SectionNumber">
     <w:name w:val="Section Number"/>
     <w:basedOn w:val="BodyTextChar"/>
   </w:style>
-  <w:style w:styleId="FootnoteReference" w:type="character">
+  <w:style w:type="character" w:styleId="FootnoteReference">
     <w:name w:val="Footnote Reference"/>
     <w:basedOn w:val="BodyTextChar"/>
     <w:rPr>
       <w:vertAlign w:val="superscript"/>
     </w:rPr>
   </w:style>
-  <w:style w:styleId="Hyperlink" w:type="character">
+  <w:style w:type="character" w:styleId="Hyperlink">
     <w:name w:val="Hyperlink"/>
     <w:basedOn w:val="BodyTextChar"/>
     <w:rPr>
       <w:color w:val="000000"/>
     </w:rPr>
   </w:style>
-  <w:style w:styleId="TOCHeading" w:type="paragraph">
+  <w:style w:type="paragraph" w:styleId="TOCHeading">
     <w:name w:val="TOC Heading"/>
     <w:basedOn w:val="Heading1"/>
     <w:next w:val="BodyText"/>
@@ -1846,11 +2389,24 @@
       <w:outlineLvl w:val="9"/>
     </w:pPr>
     <w:rPr>
-      <w:rFonts w:ascii="EB Garamond" w:cs="EB Garamond" w:eastAsia="EB Garamond" w:hAnsi="EB Garamond"/>
+      <w:rFonts w:ascii="Times New Roman" w:hAnsi="Times New Roman" w:eastAsia="Times New Roman" w:cs="Times New Roman"/>
       <w:b w:val="0"/>
       <w:bCs w:val="0"/>
       <w:color w:val="000000"/>
     </w:rPr>
+  </w:style>
+  <w:style w:type="paragraph" w:customStyle="1" w:styleId="BodyKeep">
+    <w:name w:val="Body Keep"/>
+    <w:basedOn w:val="BodyText"/>
+    <w:qFormat/>
+    <w:pPr>
+      <w:keepNext/>
+    </w:pPr>
+  </w:style>
+  <w:style w:type="paragraph" w:customStyle="1" w:styleId="BodyKeep">
+    <w:name w:val="BodyKeep"/>
+    <w:basedOn w:val="BodyText"/>
+    <w:qFormat/>
   </w:style>
   <w:style w:type="paragraph" w:customStyle="1" w:styleId="SourceCode">
     <w:name w:val="Source Code"/>

</xml_diff>

<commit_message>
calctapp answering-brief docx: TeX Gyre Schola (the typst face) via docx/reference.xml; footnotes numbered through the brief (LibreOffice read eachSect as a per-page restart, DEF-CONT-001); 1.1 in top margin so Schola's first line stays below 1 in (DEF-FORM-002); the typst parts the docx lacked: cover with rules and counsel columns, certificate of interested entities, TOC and TOA with page numbers from the multi-pass engine, heading labels, signature block, certificates of compliance and service; casd footnotes continuous too; check.sh --engine docx 7/0, casd 8/0 (fb-595.63)
</commit_message>
<xml_diff>
--- a/courts/ninth-circuit/california/federal/southern-district/motion-brief/usage/OUTPUT-motion-brief.docx
+++ b/courts/ninth-circuit/california/federal/southern-district/motion-brief/usage/OUTPUT-motion-brief.docx
@@ -280,7 +280,7 @@
         <w:sectPr>
           <w:footerReference w:type="default" r:id="rIdCasdCover"/>
           <w:footnotePr>
-            <w:numRestart w:val="eachSect"/>
+            <w:numRestart w:val="continuous"/>
           </w:footnotePr>
           <w:type w:val="nextPage"/>
           <w:pgSz w:w="12240" w:h="15840"/>
@@ -859,7 +859,7 @@
         <w:sectPr>
           <w:footerReference w:type="default" r:id="rIdCasdPage"/>
           <w:footnotePr>
-            <w:numRestart w:val="eachSect"/>
+            <w:numRestart w:val="continuous"/>
           </w:footnotePr>
           <w:type w:val="nextPage"/>
           <w:pgSz w:w="12240" w:h="15840"/>
@@ -1431,7 +1431,7 @@
     <w:sectPr>
       <w:footerReference w:type="default" r:id="rIdCasdPage"/>
       <w:footnotePr>
-        <w:numRestart w:val="eachSect"/>
+        <w:numRestart w:val="continuous"/>
       </w:footnotePr>
       <w:type w:val="nextPage"/>
       <w:pgSz w:w="12240" w:h="15840"/>

</xml_diff>